<commit_message>
Update architecture: MySQL, FastAPI, Cognito — remove Lambda and DynamoDB
</commit_message>
<xml_diff>
--- a/docs/GER_Report_final.docx
+++ b/docs/GER_Report_final.docx
@@ -2011,7 +2011,7 @@
                 <w:sz w:val="20"/>
                 <w:szCs w:val="20"/>
               </w:rPr>
-              <w:t>AWS API Gateway + Lambda (Python 3.11)</w:t>
+              <w:t>AWS API Gateway + Cognito</w:t>
             </w:r>
           </w:p>
         </w:tc>
@@ -2045,7 +2045,7 @@
                 <w:sz w:val="20"/>
                 <w:szCs w:val="20"/>
               </w:rPr>
-              <w:t>Non-relational database</w:t>
+              <w:t>Relational database</w:t>
             </w:r>
           </w:p>
         </w:tc>
@@ -2071,7 +2071,7 @@
                 <w:sz w:val="20"/>
                 <w:szCs w:val="20"/>
               </w:rPr>
-              <w:t>AWS DynamoDB (NoSQL)</w:t>
+              <w:t>MySQL (relational, on EC2)</w:t>
             </w:r>
           </w:p>
         </w:tc>
@@ -2105,7 +2105,7 @@
                 <w:sz w:val="20"/>
                 <w:szCs w:val="20"/>
               </w:rPr>
-              <w:t>Binary frame storage</w:t>
+              <w:t>Scripts, datasets, and model artefacts storage</w:t>
             </w:r>
           </w:p>
         </w:tc>
@@ -2131,7 +2131,7 @@
                 <w:sz w:val="20"/>
                 <w:szCs w:val="20"/>
               </w:rPr>
-              <w:t>AWS S3</w:t>
+              <w:t>AWS S3 (scripts, datasets, model artefacts for EC2)</w:t>
             </w:r>
           </w:p>
         </w:tc>
@@ -2394,6 +2394,58 @@
           </w:p>
         </w:tc>
       </w:tr>
+      <w:tr>
+        <w:tblPrEx>
+          <w:tblCellMar>
+            <w:top w:w="0" w:type="dxa"/>
+            <w:bottom w:w="0" w:type="dxa"/>
+          </w:tblCellMar>
+        </w:tblPrEx>
+        <w:tc>
+          <w:tcPr>
+            <w:tcW w:w="3447" w:type="dxa"/>
+            <w:tcBorders>
+              <w:top w:val="single" w:sz="1" w:space="0" w:color="AAAAAA"/>
+              <w:left w:val="single" w:sz="1" w:space="0" w:color="AAAAAA"/>
+              <w:bottom w:val="single" w:sz="1" w:space="0" w:color="AAAAAA"/>
+              <w:right w:val="single" w:sz="1" w:space="0" w:color="AAAAAA"/>
+            </w:tcBorders>
+            <w:tcMar>
+              <w:top w:w="80" w:type="dxa"/>
+              <w:left w:w="120" w:type="dxa"/>
+              <w:bottom w:w="80" w:type="dxa"/>
+              <w:right w:w="120" w:type="dxa"/>
+            </w:tcMar>
+          </w:tcPr>
+          <w:p>
+            <w:r>
+              <w:t>REST backend</w:t>
+            </w:r>
+          </w:p>
+        </w:tc>
+        <w:tc>
+          <w:tcPr>
+            <w:tcW w:w="5624" w:type="dxa"/>
+            <w:tcBorders>
+              <w:top w:val="single" w:sz="1" w:space="0" w:color="AAAAAA"/>
+              <w:left w:val="single" w:sz="1" w:space="0" w:color="AAAAAA"/>
+              <w:bottom w:val="single" w:sz="1" w:space="0" w:color="AAAAAA"/>
+              <w:right w:val="single" w:sz="1" w:space="0" w:color="AAAAAA"/>
+            </w:tcBorders>
+            <w:tcMar>
+              <w:top w:w="80" w:type="dxa"/>
+              <w:left w:w="120" w:type="dxa"/>
+              <w:bottom w:w="80" w:type="dxa"/>
+              <w:right w:w="120" w:type="dxa"/>
+            </w:tcMar>
+          </w:tcPr>
+          <w:p>
+            <w:r>
+              <w:t>FastAPI (Python, port 8000)</w:t>
+            </w:r>
+          </w:p>
+        </w:tc>
+      </w:tr>
     </w:tbl>
     <w:p/>
     <w:p>
@@ -2402,7 +2454,7 @@
         <w:jc w:val="both"/>
       </w:pPr>
       <w:r>
-        <w:t>Raspberry Pi 4 nodes capture frames via OpenCV and transmit them via HTTPS POST to AWS API Gateway under two conditions: every 20 seconds when the same group remains in the scene, and immediately upon detection of a new person entering. A Lambda function stores the raw frame on S3 and forwards the inference request to the EC2 VLM service. The VLM classifies the emotion of each visible subject individually; the group emotion is derived as a weighted average of per-subject predictions, assigning higher weight to more expressive or salient emotional states. The result — group emotion label, per-subject emotions, timestamp, location — is written to DynamoDB. The Flutter app, authenticated via Cognito, displays a park map with per-location emotion markers refreshed every 20 seconds.</w:t>
+        <w:t>Raspberry Pi 4 nodes capture frames via OpenCV and transmit them via HTTPS POST to AWS API Gateway under two conditions: every 20 seconds when the same group remains in the scene, and immediately upon detection of a new person entering. API Gateway, secured via Cognito, routes requests directly to the FastAPI backend (port 8000) running on the EC2 instance. The FastAPI service forwards the frame to the VLM inference server (port 8001, a separate process on the same EC2 instance), which classifies the emotion of each visible subject individually; the group emotion is derived as a weighted average of per-subject predictions, assigning higher weight to more expressive or salient emotional states. The result — group emotion label, per-subject emotions, timestamp, location — is written to MySQL (localhost:3306). AWS S3 stores scripts, datasets, and model artefacts used by the EC2 instance. The Flutter app, authenticated via Cognito, displays a park map with per-location emotion markers refreshed every 20 seconds.</w:t>
       </w:r>
     </w:p>
     <w:p>
@@ -2508,6 +2560,15 @@
             </w:tcMar>
           </w:tcPr>
           <w:p>
+            <w:r>
+              <w:rPr>
+                <w:rFonts w:ascii="Courier New" w:hAnsi="Courier New"/>
+                <w:sz w:val="16"/>
+              </w:rPr>
+              <w:t xml:space="preserve">+---------------------------------------------------------------------------+</w:t>
+            </w:r>
+          </w:p>
+          <w:p>
             <w:pPr>
               <w:jc w:val="center"/>
             </w:pPr>
@@ -2519,7 +2580,394 @@
                 <w:sz w:val="20"/>
                 <w:szCs w:val="20"/>
               </w:rPr>
-              <w:t>Fig. 2 — Deployment diagram: Raspberry Pi 4 → API Gateway → Lambda → EC2 (VLM) → DynamoDB + S3 → Flutter App [placeholder]</w:t>
+              <w:t>Fig. 2 — Deployment diagram: Raspberry Pi 4 → API Gateway + Cognito → FastAPI EC2 (port 8000) → VLM server (port 8001) → MySQL → Flutter App [placeholder]</w:t>
+            </w:r>
+          </w:p>
+          <w:p>
+            <w:r>
+              <w:rPr>
+                <w:rFonts w:ascii="Courier New" w:hAnsi="Courier New"/>
+                <w:sz w:val="16"/>
+              </w:rPr>
+              <w:t xml:space="preserve">|  EDGE                                                                     |</w:t>
+            </w:r>
+          </w:p>
+          <w:p>
+            <w:r>
+              <w:rPr>
+                <w:rFonts w:ascii="Courier New" w:hAnsi="Courier New"/>
+                <w:sz w:val="16"/>
+              </w:rPr>
+              <w:t xml:space="preserve">|                                                                           |</w:t>
+            </w:r>
+          </w:p>
+          <w:p>
+            <w:r>
+              <w:rPr>
+                <w:rFonts w:ascii="Courier New" w:hAnsi="Courier New"/>
+                <w:sz w:val="16"/>
+              </w:rPr>
+              <w:t xml:space="preserve">|  +--------------------+                                                   |</w:t>
+            </w:r>
+          </w:p>
+          <w:p>
+            <w:r>
+              <w:rPr>
+                <w:rFonts w:ascii="Courier New" w:hAnsi="Courier New"/>
+                <w:sz w:val="16"/>
+              </w:rPr>
+              <w:t xml:space="preserve">|  |  Raspberry Pi 4    |  JPEG frame (REST/HTTPS)                         |</w:t>
+            </w:r>
+          </w:p>
+          <w:p>
+            <w:r>
+              <w:rPr>
+                <w:rFonts w:ascii="Courier New" w:hAnsi="Courier New"/>
+                <w:sz w:val="16"/>
+              </w:rPr>
+              <w:t xml:space="preserve">|  |  USB camera        | ------------------------------------------------&gt; |</w:t>
+            </w:r>
+          </w:p>
+          <w:p>
+            <w:r>
+              <w:rPr>
+                <w:rFonts w:ascii="Courier New" w:hAnsi="Courier New"/>
+                <w:sz w:val="16"/>
+              </w:rPr>
+              <w:t xml:space="preserve">|  |  (capture+compress)|                                                   |</w:t>
+            </w:r>
+          </w:p>
+          <w:p>
+            <w:r>
+              <w:rPr>
+                <w:rFonts w:ascii="Courier New" w:hAnsi="Courier New"/>
+                <w:sz w:val="16"/>
+              </w:rPr>
+              <w:t xml:space="preserve">|  +--------------------+                                                   |</w:t>
+            </w:r>
+          </w:p>
+          <w:p>
+            <w:r>
+              <w:rPr>
+                <w:rFonts w:ascii="Courier New" w:hAnsi="Courier New"/>
+                <w:sz w:val="16"/>
+              </w:rPr>
+              <w:t xml:space="preserve">+---------------------------------------------------------------------------+</w:t>
+            </w:r>
+          </w:p>
+          <w:p>
+            <w:r>
+              <w:rPr>
+                <w:rFonts w:ascii="Courier New" w:hAnsi="Courier New"/>
+                <w:sz w:val="16"/>
+              </w:rPr>
+              <w:t xml:space="preserve">                                     |</w:t>
+            </w:r>
+          </w:p>
+          <w:p>
+            <w:r>
+              <w:rPr>
+                <w:rFonts w:ascii="Courier New" w:hAnsi="Courier New"/>
+                <w:sz w:val="16"/>
+              </w:rPr>
+              <w:t xml:space="preserve">                                     v</w:t>
+            </w:r>
+          </w:p>
+          <w:p>
+            <w:r>
+              <w:rPr>
+                <w:rFonts w:ascii="Courier New" w:hAnsi="Courier New"/>
+                <w:sz w:val="16"/>
+              </w:rPr>
+              <w:t xml:space="preserve">+---------------------------------------------------------------------------+</w:t>
+            </w:r>
+          </w:p>
+          <w:p>
+            <w:r>
+              <w:rPr>
+                <w:rFonts w:ascii="Courier New" w:hAnsi="Courier New"/>
+                <w:sz w:val="16"/>
+              </w:rPr>
+              <w:t xml:space="preserve">|  CLOUD (AWS eu-west-1)                                                    |</w:t>
+            </w:r>
+          </w:p>
+          <w:p>
+            <w:r>
+              <w:rPr>
+                <w:rFonts w:ascii="Courier New" w:hAnsi="Courier New"/>
+                <w:sz w:val="16"/>
+              </w:rPr>
+              <w:t xml:space="preserve">|                                                                           |</w:t>
+            </w:r>
+          </w:p>
+          <w:p>
+            <w:r>
+              <w:rPr>
+                <w:rFonts w:ascii="Courier New" w:hAnsi="Courier New"/>
+                <w:sz w:val="16"/>
+              </w:rPr>
+              <w:t xml:space="preserve">|  +----------------+                                                       |</w:t>
+            </w:r>
+          </w:p>
+          <w:p>
+            <w:r>
+              <w:rPr>
+                <w:rFonts w:ascii="Courier New" w:hAnsi="Courier New"/>
+                <w:sz w:val="16"/>
+              </w:rPr>
+              <w:t xml:space="preserve">|  |  API Gateway   |                                                       |</w:t>
+            </w:r>
+          </w:p>
+          <w:p>
+            <w:r>
+              <w:rPr>
+                <w:rFonts w:ascii="Courier New" w:hAnsi="Courier New"/>
+                <w:sz w:val="16"/>
+              </w:rPr>
+              <w:t xml:space="preserve">|  |  + Cognito auth|                                                       |</w:t>
+            </w:r>
+          </w:p>
+          <w:p>
+            <w:r>
+              <w:rPr>
+                <w:rFonts w:ascii="Courier New" w:hAnsi="Courier New"/>
+                <w:sz w:val="16"/>
+              </w:rPr>
+              <w:t xml:space="preserve">|  +-------+--------+                                                       |</w:t>
+            </w:r>
+          </w:p>
+          <w:p>
+            <w:r>
+              <w:rPr>
+                <w:rFonts w:ascii="Courier New" w:hAnsi="Courier New"/>
+                <w:sz w:val="16"/>
+              </w:rPr>
+              <w:t xml:space="preserve">|          |                                                                 |</w:t>
+            </w:r>
+          </w:p>
+          <w:p>
+            <w:r>
+              <w:rPr>
+                <w:rFonts w:ascii="Courier New" w:hAnsi="Courier New"/>
+                <w:sz w:val="16"/>
+              </w:rPr>
+              <w:t xml:space="preserve">|          v                                                                 |</w:t>
+            </w:r>
+          </w:p>
+          <w:p>
+            <w:r>
+              <w:rPr>
+                <w:rFonts w:ascii="Courier New" w:hAnsi="Courier New"/>
+                <w:sz w:val="16"/>
+              </w:rPr>
+              <w:t xml:space="preserve">|  +--------------------------------------------------------------------+   |</w:t>
+            </w:r>
+          </w:p>
+          <w:p>
+            <w:r>
+              <w:rPr>
+                <w:rFonts w:ascii="Courier New" w:hAnsi="Courier New"/>
+                <w:sz w:val="16"/>
+              </w:rPr>
+              <w:t xml:space="preserve">|  |  EC2 g4dn.xlarge (same instance)                                   |   |</w:t>
+            </w:r>
+          </w:p>
+          <w:p>
+            <w:r>
+              <w:rPr>
+                <w:rFonts w:ascii="Courier New" w:hAnsi="Courier New"/>
+                <w:sz w:val="16"/>
+              </w:rPr>
+              <w:t xml:space="preserve">|  |                                                                    |   |</w:t>
+            </w:r>
+          </w:p>
+          <w:p>
+            <w:r>
+              <w:rPr>
+                <w:rFonts w:ascii="Courier New" w:hAnsi="Courier New"/>
+                <w:sz w:val="16"/>
+              </w:rPr>
+              <w:t xml:space="preserve">|  |  +-------------------+     +------------------------------+        |   |</w:t>
+            </w:r>
+          </w:p>
+          <w:p>
+            <w:r>
+              <w:rPr>
+                <w:rFonts w:ascii="Courier New" w:hAnsi="Courier New"/>
+                <w:sz w:val="16"/>
+              </w:rPr>
+              <w:t xml:space="preserve">|  |  |  FastAPI backend  |----&gt;|  VLM inference server        |        |   |</w:t>
+            </w:r>
+          </w:p>
+          <w:p>
+            <w:r>
+              <w:rPr>
+                <w:rFonts w:ascii="Courier New" w:hAnsi="Courier New"/>
+                <w:sz w:val="16"/>
+              </w:rPr>
+              <w:t xml:space="preserve">|  |  |  (port 8000)      |     |  (separate process, port     |        |   |</w:t>
+            </w:r>
+          </w:p>
+          <w:p>
+            <w:r>
+              <w:rPr>
+                <w:rFonts w:ascii="Courier New" w:hAnsi="Courier New"/>
+                <w:sz w:val="16"/>
+              </w:rPr>
+              <w:t xml:space="preserve">|  |  +--------+----------+     |   8001)                      |        |   |</w:t>
+            </w:r>
+          </w:p>
+          <w:p>
+            <w:r>
+              <w:rPr>
+                <w:rFonts w:ascii="Courier New" w:hAnsi="Courier New"/>
+                <w:sz w:val="16"/>
+              </w:rPr>
+              <w:t xml:space="preserve">|  |           |                +------------------------------+        |   |</w:t>
+            </w:r>
+          </w:p>
+          <w:p>
+            <w:r>
+              <w:rPr>
+                <w:rFonts w:ascii="Courier New" w:hAnsi="Courier New"/>
+                <w:sz w:val="16"/>
+              </w:rPr>
+              <w:t xml:space="preserve">|  |           v                                                        |   |</w:t>
+            </w:r>
+          </w:p>
+          <w:p>
+            <w:r>
+              <w:rPr>
+                <w:rFonts w:ascii="Courier New" w:hAnsi="Courier New"/>
+                <w:sz w:val="16"/>
+              </w:rPr>
+              <w:t xml:space="preserve">|  |  +-------------------+                                             |   |</w:t>
+            </w:r>
+          </w:p>
+          <w:p>
+            <w:r>
+              <w:rPr>
+                <w:rFonts w:ascii="Courier New" w:hAnsi="Courier New"/>
+                <w:sz w:val="16"/>
+              </w:rPr>
+              <w:t xml:space="preserve">|  |  |  MySQL            |                                             |   |</w:t>
+            </w:r>
+          </w:p>
+          <w:p>
+            <w:r>
+              <w:rPr>
+                <w:rFonts w:ascii="Courier New" w:hAnsi="Courier New"/>
+                <w:sz w:val="16"/>
+              </w:rPr>
+              <w:t xml:space="preserve">|  |  |  (localhost:3306) |                                             |   |</w:t>
+            </w:r>
+          </w:p>
+          <w:p>
+            <w:r>
+              <w:rPr>
+                <w:rFonts w:ascii="Courier New" w:hAnsi="Courier New"/>
+                <w:sz w:val="16"/>
+              </w:rPr>
+              <w:t xml:space="preserve">|  |  +-------------------+                                             |   |</w:t>
+            </w:r>
+          </w:p>
+          <w:p>
+            <w:r>
+              <w:rPr>
+                <w:rFonts w:ascii="Courier New" w:hAnsi="Courier New"/>
+                <w:sz w:val="16"/>
+              </w:rPr>
+              <w:t xml:space="preserve">|  +--------------------------------------------------------------------+   |</w:t>
+            </w:r>
+          </w:p>
+          <w:p>
+            <w:r>
+              <w:rPr>
+                <w:rFonts w:ascii="Courier New" w:hAnsi="Courier New"/>
+                <w:sz w:val="16"/>
+              </w:rPr>
+              <w:t xml:space="preserve">|                                                                           |</w:t>
+            </w:r>
+          </w:p>
+          <w:p>
+            <w:r>
+              <w:rPr>
+                <w:rFonts w:ascii="Courier New" w:hAnsi="Courier New"/>
+                <w:sz w:val="16"/>
+              </w:rPr>
+              <w:t xml:space="preserve">|  +--------------+      +--------------------------------------+           |</w:t>
+            </w:r>
+          </w:p>
+          <w:p>
+            <w:r>
+              <w:rPr>
+                <w:rFonts w:ascii="Courier New" w:hAnsi="Courier New"/>
+                <w:sz w:val="16"/>
+              </w:rPr>
+              <w:t xml:space="preserve">|  |  S3          |      |  Flutter Mobile App                  |           |</w:t>
+            </w:r>
+          </w:p>
+          <w:p>
+            <w:r>
+              <w:rPr>
+                <w:rFonts w:ascii="Courier New" w:hAnsi="Courier New"/>
+                <w:sz w:val="16"/>
+              </w:rPr>
+              <w:t xml:space="preserve">|  |  (scripts,   |      |  (group emotion dashboard)           |           |</w:t>
+            </w:r>
+          </w:p>
+          <w:p>
+            <w:r>
+              <w:rPr>
+                <w:rFonts w:ascii="Courier New" w:hAnsi="Courier New"/>
+                <w:sz w:val="16"/>
+              </w:rPr>
+              <w:t xml:space="preserve">|  |   datasets,  |      +--------------------------------------+           |</w:t>
+            </w:r>
+          </w:p>
+          <w:p>
+            <w:r>
+              <w:rPr>
+                <w:rFonts w:ascii="Courier New" w:hAnsi="Courier New"/>
+                <w:sz w:val="16"/>
+              </w:rPr>
+              <w:t xml:space="preserve">|  |   model      |                                                         |</w:t>
+            </w:r>
+          </w:p>
+          <w:p>
+            <w:r>
+              <w:rPr>
+                <w:rFonts w:ascii="Courier New" w:hAnsi="Courier New"/>
+                <w:sz w:val="16"/>
+              </w:rPr>
+              <w:t xml:space="preserve">|  |   artefacts  |                                                         |</w:t>
+            </w:r>
+          </w:p>
+          <w:p>
+            <w:r>
+              <w:rPr>
+                <w:rFonts w:ascii="Courier New" w:hAnsi="Courier New"/>
+                <w:sz w:val="16"/>
+              </w:rPr>
+              <w:t xml:space="preserve">|  |   for EC2)   |                                                         |</w:t>
+            </w:r>
+          </w:p>
+          <w:p>
+            <w:r>
+              <w:rPr>
+                <w:rFonts w:ascii="Courier New" w:hAnsi="Courier New"/>
+                <w:sz w:val="16"/>
+              </w:rPr>
+              <w:t xml:space="preserve">|  +--------------+                                                         |</w:t>
+            </w:r>
+          </w:p>
+          <w:p>
+            <w:r>
+              <w:rPr>
+                <w:rFonts w:ascii="Courier New" w:hAnsi="Courier New"/>
+                <w:sz w:val="16"/>
+              </w:rPr>
+              <w:t xml:space="preserve">+---------------------------------------------------------------------------+</w:t>
             </w:r>
           </w:p>
         </w:tc>
@@ -2596,8 +3044,7 @@
                 <w:sz w:val="20"/>
                 <w:szCs w:val="20"/>
               </w:rPr>
-              <w:lastRenderedPageBreak/>
-              <w:t>Fig. 3 — Lambda function: frame forwarding to EC2 and DynamoDB write. [placeholder]</w:t>
+              <w:t>Fig. 3 — FastAPI backend: frame ingestion endpoint and VLM inference forwarding. [placeholder]</w:t>
             </w:r>
           </w:p>
         </w:tc>
@@ -2615,7 +3062,7 @@
           <w:sz w:val="20"/>
           <w:szCs w:val="20"/>
         </w:rPr>
-        <w:t>Figure 3 — Relevant code: AWS Lambda function for inference forwarding and result storage.</w:t>
+        <w:t>Figure 3 — Relevant code: FastAPI backend endpoint for frame ingestion and VLM inference forwarding.</w:t>
       </w:r>
     </w:p>
     <w:tbl>
@@ -4975,7 +5422,7 @@
         <w:jc w:val="both"/>
       </w:pPr>
       <w:r>
-        <w:t>The end-to-end latency — frame capture to DynamoDB write — is estimated at 1.5–3.2s under normal conditions (frame encoding: ∼0.1s; transmission: ∼0.3–0.8s; VLM inference: ∼1.0–2.2s; DB write: ∼0.05s), satisfying NFR1. The use of a direct single-word prompt eliminated all invalid predictions and substantially improved performance compared to complex JSON prompts. Grouping negative emotions into a distress class raised the Macro F1 from 0.436 to 0.691, reflecting a more operationally meaningful classification for park management.</w:t>
+        <w:t>The end-to-end latency — frame capture to MySQL write — is estimated at 1.5–3.2s under normal conditions (frame encoding: ∼0.1s; transmission: ∼0.3–0.8s; VLM inference: ∼1.0–2.2s; DB write: ∼0.05s), satisfying NFR1. The use of a direct single-word prompt eliminated all invalid predictions and substantially improved performance compared to complex JSON prompts. Grouping negative emotions into a distress class raised the Macro F1 from 0.436 to 0.691, reflecting a more operationally meaningful classification for park management.</w:t>
       </w:r>
     </w:p>
     <w:p>

</xml_diff>